<commit_message>
docs: attribute each integration trap to its source review
The "Traps this project already walked into" table introduced eight items
with "Each of these was found during design or code review". That was true
for seven of them and false for the eighth: token refresh appears in none of
the five critic reports, and could not — this build has no OAuth tokens.

Adds a "Found by" column so every row is traceable (architecture review
APPLY-C/D/F/G, code review P0-3/APPLY-A, or product discovery), and labels
the token-refresh row explicitly as general advice rather than a finding.

This is the same defect class the review process caught seven times in the
project's own artifacts — a claim with nothing underneath it.

Co-Authored-By: Claude Opus 5 <noreply@anthropic.com>
</commit_message>
<xml_diff>
--- a/docs/handoff/Connecting-To-Live-Google.docx
+++ b/docs/handoff/Connecting-To-Live-Google.docx
@@ -3281,7 +3281,15 @@
         <w:spacing w:after="140" w:line="276"/>
       </w:pPr>
       <w:r>
-        <w:t xml:space="preserve">Each of these was found during design or code review, before any of it shipped. They are recorded here so you do not rediscover them the hard way.</w:t>
+        <w:t xml:space="preserve">The first seven of these were found during design or code review of this project, before any of it shipped, and each is traceable to a specific review finding. They are recorded here so you do not rediscover them the hard way.</w:t>
+      </w:r>
+    </w:p>
+    <w:p>
+      <w:pPr>
+        <w:spacing w:after="140" w:line="276"/>
+      </w:pPr>
+      <w:r>
+        <w:t xml:space="preserve">The eighth is different, and is labelled as such: it is ordinary advice for any Google integration, not something this project discovered. It is included because it will bite you, not because anyone here hit it.</w:t>
       </w:r>
     </w:p>
     <w:tbl>
@@ -3297,8 +3305,9 @@
         </w:tblBorders>
       </w:tblPr>
       <w:tblGrid>
-        <w:gridCol w:w="3600"/>
-        <w:gridCol w:w="6480"/>
+        <w:gridCol w:w="2700"/>
+        <w:gridCol w:w="4700"/>
+        <w:gridCol w:w="2680"/>
       </w:tblGrid>
       <w:tr>
         <w:trPr>
@@ -3306,7 +3315,7 @@
         </w:trPr>
         <w:tc>
           <w:tcPr>
-            <w:tcW w:type="dxa" w:w="3600"/>
+            <w:tcW w:type="dxa" w:w="2700"/>
             <w:shd w:fill="F4F1E9" w:val="clear"/>
             <w:tcMar>
               <w:top w:type="dxa" w:w="90"/>
@@ -3329,7 +3338,7 @@
         </w:tc>
         <w:tc>
           <w:tcPr>
-            <w:tcW w:type="dxa" w:w="6480"/>
+            <w:tcW w:type="dxa" w:w="4700"/>
             <w:shd w:fill="F4F1E9" w:val="clear"/>
             <w:tcMar>
               <w:top w:type="dxa" w:w="90"/>
@@ -3350,11 +3359,34 @@
             </w:r>
           </w:p>
         </w:tc>
-      </w:tr>
-      <w:tr>
-        <w:tc>
-          <w:tcPr>
-            <w:tcW w:type="dxa" w:w="3600"/>
+        <w:tc>
+          <w:tcPr>
+            <w:tcW w:type="dxa" w:w="2680"/>
+            <w:shd w:fill="F4F1E9" w:val="clear"/>
+            <w:tcMar>
+              <w:top w:type="dxa" w:w="90"/>
+              <w:left w:type="dxa" w:w="120"/>
+              <w:bottom w:type="dxa" w:w="90"/>
+              <w:right w:type="dxa" w:w="120"/>
+            </w:tcMar>
+          </w:tcPr>
+          <w:p>
+            <w:r>
+              <w:rPr>
+                <w:b/>
+                <w:bCs/>
+                <w:sz w:val="19"/>
+                <w:szCs w:val="19"/>
+              </w:rPr>
+              <w:t xml:space="preserve">Found by</w:t>
+            </w:r>
+          </w:p>
+        </w:tc>
+      </w:tr>
+      <w:tr>
+        <w:tc>
+          <w:tcPr>
+            <w:tcW w:type="dxa" w:w="2700"/>
             <w:tcMar>
               <w:top w:type="dxa" w:w="90"/>
               <w:left w:type="dxa" w:w="120"/>
@@ -3374,29 +3406,49 @@
         </w:tc>
         <w:tc>
           <w:tcPr>
-            <w:tcW w:type="dxa" w:w="6480"/>
-            <w:tcMar>
-              <w:top w:type="dxa" w:w="90"/>
-              <w:left w:type="dxa" w:w="120"/>
-              <w:bottom w:type="dxa" w:w="90"/>
-              <w:right w:type="dxa" w:w="120"/>
-            </w:tcMar>
-          </w:tcPr>
-          <w:p>
-            <w:r>
-              <w:rPr>
-                <w:sz w:val="19"/>
-                <w:szCs w:val="19"/>
-              </w:rPr>
-              <w:t xml:space="preserve">Google returns published posts only. Every draft and scheduled post is silently dropped, and every test still passes because the fake behaves differently. This was rated the most dangerous finding in the review.</w:t>
-            </w:r>
-          </w:p>
-        </w:tc>
-      </w:tr>
-      <w:tr>
-        <w:tc>
-          <w:tcPr>
-            <w:tcW w:type="dxa" w:w="3600"/>
+            <w:tcW w:type="dxa" w:w="4700"/>
+            <w:tcMar>
+              <w:top w:type="dxa" w:w="90"/>
+              <w:left w:type="dxa" w:w="120"/>
+              <w:bottom w:type="dxa" w:w="90"/>
+              <w:right w:type="dxa" w:w="120"/>
+            </w:tcMar>
+          </w:tcPr>
+          <w:p>
+            <w:r>
+              <w:rPr>
+                <w:sz w:val="19"/>
+                <w:szCs w:val="19"/>
+              </w:rPr>
+              <w:t xml:space="preserve">Google returns published posts only. Every draft and scheduled post is silently dropped, and every test still passes because the fake behaves differently. Rated the most dangerous finding in the review.</w:t>
+            </w:r>
+          </w:p>
+        </w:tc>
+        <w:tc>
+          <w:tcPr>
+            <w:tcW w:type="dxa" w:w="2680"/>
+            <w:tcMar>
+              <w:top w:type="dxa" w:w="90"/>
+              <w:left w:type="dxa" w:w="120"/>
+              <w:bottom w:type="dxa" w:w="90"/>
+              <w:right w:type="dxa" w:w="120"/>
+            </w:tcMar>
+          </w:tcPr>
+          <w:p>
+            <w:r>
+              <w:rPr>
+                <w:sz w:val="19"/>
+                <w:szCs w:val="19"/>
+              </w:rPr>
+              <w:t xml:space="preserve">Architecture review, APPLY-D</w:t>
+            </w:r>
+          </w:p>
+        </w:tc>
+      </w:tr>
+      <w:tr>
+        <w:tc>
+          <w:tcPr>
+            <w:tcW w:type="dxa" w:w="2700"/>
             <w:tcMar>
               <w:top w:type="dxa" w:w="90"/>
               <w:left w:type="dxa" w:w="120"/>
@@ -3416,7 +3468,7 @@
         </w:tc>
         <w:tc>
           <w:tcPr>
-            <w:tcW w:type="dxa" w:w="6480"/>
+            <w:tcW w:type="dxa" w:w="4700"/>
             <w:tcMar>
               <w:top w:type="dxa" w:w="90"/>
               <w:left w:type="dxa" w:w="120"/>
@@ -3434,11 +3486,31 @@
             </w:r>
           </w:p>
         </w:tc>
-      </w:tr>
-      <w:tr>
-        <w:tc>
-          <w:tcPr>
-            <w:tcW w:type="dxa" w:w="3600"/>
+        <w:tc>
+          <w:tcPr>
+            <w:tcW w:type="dxa" w:w="2680"/>
+            <w:tcMar>
+              <w:top w:type="dxa" w:w="90"/>
+              <w:left w:type="dxa" w:w="120"/>
+              <w:bottom w:type="dxa" w:w="90"/>
+              <w:right w:type="dxa" w:w="120"/>
+            </w:tcMar>
+          </w:tcPr>
+          <w:p>
+            <w:r>
+              <w:rPr>
+                <w:sz w:val="19"/>
+                <w:szCs w:val="19"/>
+              </w:rPr>
+              <w:t xml:space="preserve">Product discovery; the original requirements had this wrong</w:t>
+            </w:r>
+          </w:p>
+        </w:tc>
+      </w:tr>
+      <w:tr>
+        <w:tc>
+          <w:tcPr>
+            <w:tcW w:type="dxa" w:w="2700"/>
             <w:tcMar>
               <w:top w:type="dxa" w:w="90"/>
               <w:left w:type="dxa" w:w="120"/>
@@ -3458,7 +3530,7 @@
         </w:tc>
         <w:tc>
           <w:tcPr>
-            <w:tcW w:type="dxa" w:w="6480"/>
+            <w:tcW w:type="dxa" w:w="4700"/>
             <w:tcMar>
               <w:top w:type="dxa" w:w="90"/>
               <w:left w:type="dxa" w:w="120"/>
@@ -3476,11 +3548,31 @@
             </w:r>
           </w:p>
         </w:tc>
-      </w:tr>
-      <w:tr>
-        <w:tc>
-          <w:tcPr>
-            <w:tcW w:type="dxa" w:w="3600"/>
+        <w:tc>
+          <w:tcPr>
+            <w:tcW w:type="dxa" w:w="2680"/>
+            <w:tcMar>
+              <w:top w:type="dxa" w:w="90"/>
+              <w:left w:type="dxa" w:w="120"/>
+              <w:bottom w:type="dxa" w:w="90"/>
+              <w:right w:type="dxa" w:w="120"/>
+            </w:tcMar>
+          </w:tcPr>
+          <w:p>
+            <w:r>
+              <w:rPr>
+                <w:sz w:val="19"/>
+                <w:szCs w:val="19"/>
+              </w:rPr>
+              <w:t xml:space="preserve">Product discovery; also missing from the original requirements</w:t>
+            </w:r>
+          </w:p>
+        </w:tc>
+      </w:tr>
+      <w:tr>
+        <w:tc>
+          <w:tcPr>
+            <w:tcW w:type="dxa" w:w="2700"/>
             <w:tcMar>
               <w:top w:type="dxa" w:w="90"/>
               <w:left w:type="dxa" w:w="120"/>
@@ -3500,7 +3592,7 @@
         </w:tc>
         <w:tc>
           <w:tcPr>
-            <w:tcW w:type="dxa" w:w="6480"/>
+            <w:tcW w:type="dxa" w:w="4700"/>
             <w:tcMar>
               <w:top w:type="dxa" w:w="90"/>
               <w:left w:type="dxa" w:w="120"/>
@@ -3518,11 +3610,31 @@
             </w:r>
           </w:p>
         </w:tc>
-      </w:tr>
-      <w:tr>
-        <w:tc>
-          <w:tcPr>
-            <w:tcW w:type="dxa" w:w="3600"/>
+        <w:tc>
+          <w:tcPr>
+            <w:tcW w:type="dxa" w:w="2680"/>
+            <w:tcMar>
+              <w:top w:type="dxa" w:w="90"/>
+              <w:left w:type="dxa" w:w="120"/>
+              <w:bottom w:type="dxa" w:w="90"/>
+              <w:right w:type="dxa" w:w="120"/>
+            </w:tcMar>
+          </w:tcPr>
+          <w:p>
+            <w:r>
+              <w:rPr>
+                <w:sz w:val="19"/>
+                <w:szCs w:val="19"/>
+              </w:rPr>
+              <w:t xml:space="preserve">Architecture review, APPLY-F</w:t>
+            </w:r>
+          </w:p>
+        </w:tc>
+      </w:tr>
+      <w:tr>
+        <w:tc>
+          <w:tcPr>
+            <w:tcW w:type="dxa" w:w="2700"/>
             <w:tcMar>
               <w:top w:type="dxa" w:w="90"/>
               <w:left w:type="dxa" w:w="120"/>
@@ -3542,7 +3654,7 @@
         </w:tc>
         <w:tc>
           <w:tcPr>
-            <w:tcW w:type="dxa" w:w="6480"/>
+            <w:tcW w:type="dxa" w:w="4700"/>
             <w:tcMar>
               <w:top w:type="dxa" w:w="90"/>
               <w:left w:type="dxa" w:w="120"/>
@@ -3560,11 +3672,31 @@
             </w:r>
           </w:p>
         </w:tc>
-      </w:tr>
-      <w:tr>
-        <w:tc>
-          <w:tcPr>
-            <w:tcW w:type="dxa" w:w="3600"/>
+        <w:tc>
+          <w:tcPr>
+            <w:tcW w:type="dxa" w:w="2680"/>
+            <w:tcMar>
+              <w:top w:type="dxa" w:w="90"/>
+              <w:left w:type="dxa" w:w="120"/>
+              <w:bottom w:type="dxa" w:w="90"/>
+              <w:right w:type="dxa" w:w="120"/>
+            </w:tcMar>
+          </w:tcPr>
+          <w:p>
+            <w:r>
+              <w:rPr>
+                <w:sz w:val="19"/>
+                <w:szCs w:val="19"/>
+              </w:rPr>
+              <w:t xml:space="preserve">Code review, P0-3 — the mock had actually done this</w:t>
+            </w:r>
+          </w:p>
+        </w:tc>
+      </w:tr>
+      <w:tr>
+        <w:tc>
+          <w:tcPr>
+            <w:tcW w:type="dxa" w:w="2700"/>
             <w:tcMar>
               <w:top w:type="dxa" w:w="90"/>
               <w:left w:type="dxa" w:w="120"/>
@@ -3584,7 +3716,7 @@
         </w:tc>
         <w:tc>
           <w:tcPr>
-            <w:tcW w:type="dxa" w:w="6480"/>
+            <w:tcW w:type="dxa" w:w="4700"/>
             <w:tcMar>
               <w:top w:type="dxa" w:w="90"/>
               <w:left w:type="dxa" w:w="120"/>
@@ -3602,11 +3734,31 @@
             </w:r>
           </w:p>
         </w:tc>
-      </w:tr>
-      <w:tr>
-        <w:tc>
-          <w:tcPr>
-            <w:tcW w:type="dxa" w:w="3600"/>
+        <w:tc>
+          <w:tcPr>
+            <w:tcW w:type="dxa" w:w="2680"/>
+            <w:tcMar>
+              <w:top w:type="dxa" w:w="90"/>
+              <w:left w:type="dxa" w:w="120"/>
+              <w:bottom w:type="dxa" w:w="90"/>
+              <w:right w:type="dxa" w:w="120"/>
+            </w:tcMar>
+          </w:tcPr>
+          <w:p>
+            <w:r>
+              <w:rPr>
+                <w:sz w:val="19"/>
+                <w:szCs w:val="19"/>
+              </w:rPr>
+              <w:t xml:space="preserve">Architecture review APPLY-C, again at code review APPLY-A</w:t>
+            </w:r>
+          </w:p>
+        </w:tc>
+      </w:tr>
+      <w:tr>
+        <w:tc>
+          <w:tcPr>
+            <w:tcW w:type="dxa" w:w="2700"/>
             <w:tcMar>
               <w:top w:type="dxa" w:w="90"/>
               <w:left w:type="dxa" w:w="120"/>
@@ -3626,7 +3778,7 @@
         </w:tc>
         <w:tc>
           <w:tcPr>
-            <w:tcW w:type="dxa" w:w="6480"/>
+            <w:tcW w:type="dxa" w:w="4700"/>
             <w:tcMar>
               <w:top w:type="dxa" w:w="90"/>
               <w:left w:type="dxa" w:w="120"/>
@@ -3644,11 +3796,31 @@
             </w:r>
           </w:p>
         </w:tc>
-      </w:tr>
-      <w:tr>
-        <w:tc>
-          <w:tcPr>
-            <w:tcW w:type="dxa" w:w="3600"/>
+        <w:tc>
+          <w:tcPr>
+            <w:tcW w:type="dxa" w:w="2680"/>
+            <w:tcMar>
+              <w:top w:type="dxa" w:w="90"/>
+              <w:left w:type="dxa" w:w="120"/>
+              <w:bottom w:type="dxa" w:w="90"/>
+              <w:right w:type="dxa" w:w="120"/>
+            </w:tcMar>
+          </w:tcPr>
+          <w:p>
+            <w:r>
+              <w:rPr>
+                <w:sz w:val="19"/>
+                <w:szCs w:val="19"/>
+              </w:rPr>
+              <w:t xml:space="preserve">Architecture review, APPLY-G</w:t>
+            </w:r>
+          </w:p>
+        </w:tc>
+      </w:tr>
+      <w:tr>
+        <w:tc>
+          <w:tcPr>
+            <w:tcW w:type="dxa" w:w="2700"/>
             <w:tcMar>
               <w:top w:type="dxa" w:w="90"/>
               <w:left w:type="dxa" w:w="120"/>
@@ -3668,7 +3840,7 @@
         </w:tc>
         <w:tc>
           <w:tcPr>
-            <w:tcW w:type="dxa" w:w="6480"/>
+            <w:tcW w:type="dxa" w:w="4700"/>
             <w:tcMar>
               <w:top w:type="dxa" w:w="90"/>
               <w:left w:type="dxa" w:w="120"/>
@@ -3683,6 +3855,35 @@
                 <w:szCs w:val="19"/>
               </w:rPr>
               <w:t xml:space="preserve">A 50-post transfer can outlive a one-hour access token and die in the middle.</w:t>
+            </w:r>
+          </w:p>
+        </w:tc>
+        <w:tc>
+          <w:tcPr>
+            <w:tcW w:type="dxa" w:w="2680"/>
+            <w:tcMar>
+              <w:top w:type="dxa" w:w="90"/>
+              <w:left w:type="dxa" w:w="120"/>
+              <w:bottom w:type="dxa" w:w="90"/>
+              <w:right w:type="dxa" w:w="120"/>
+            </w:tcMar>
+          </w:tcPr>
+          <w:p>
+            <w:r>
+              <w:rPr>
+                <w:b/>
+                <w:bCs/>
+                <w:sz w:val="19"/>
+                <w:szCs w:val="19"/>
+              </w:rPr>
+              <w:t xml:space="preserve">Not a finding from this project. </w:t>
+            </w:r>
+            <w:r>
+              <w:rPr>
+                <w:sz w:val="19"/>
+                <w:szCs w:val="19"/>
+              </w:rPr>
+              <w:t xml:space="preserve">General advice — this build has no OAuth tokens to refresh.</w:t>
             </w:r>
           </w:p>
         </w:tc>

</xml_diff>